<commit_message>
NDA: name Charlie Mascagni as Scag Scapes' owner and principal, Ned in his personal capacity
Co-Authored-By: Claude Fable 5.1 <noreply@anthropic.com>
Claude-Session: https://claude.ai/code/session_01LoK8Mi2K1W9PhhoHM3MdEb
</commit_message>
<xml_diff>
--- a/docs/Scag-Scapes-Mutual-NDA.docx
+++ b/docs/Scag-Scapes-Mutual-NDA.docx
@@ -39,7 +39,7 @@
         <w:t xml:space="preserve">Party A: </w:t>
       </w:r>
       <w:r>
-        <w:t xml:space="preserve">Scag Scapes LLC, a Louisiana limited liability company (“Scag Scapes”), and</w:t>
+        <w:t xml:space="preserve">Scag Scapes LLC, a Louisiana limited liability company, acting through its owner and principal Charlie Mascagni, who signs on its behalf and is personally bound by it (“Scag Scapes”), and</w:t>
       </w:r>
     </w:p>
     <w:p>
@@ -54,7 +54,7 @@
         <w:t xml:space="preserve">Party B: </w:t>
       </w:r>
       <w:r>
-        <w:t xml:space="preserve">Gerald Thomas Pearson Jr. (“Ned Pearson”), an individual doing business in Baton Rouge, Louisiana.</w:t>
+        <w:t xml:space="preserve">Gerald Thomas Pearson Jr. (“Ned Pearson”), in his personal and individual capacity, of Baton Rouge, Louisiana.</w:t>
       </w:r>
     </w:p>
     <w:p>
@@ -392,7 +392,7 @@
         <w:spacing w:after="160"/>
       </w:pPr>
       <w:r>
-        <w:t xml:space="preserve">Title: Owner</w:t>
+        <w:t xml:space="preserve">Title: Owner and Principal</w:t>
       </w:r>
     </w:p>
     <w:p>

</xml_diff>